<commit_message>
création du diagramme de la bdd, avec modification du script d'importation de la bdd, ajout des PK et FK, modification du détails étude de cas
</commit_message>
<xml_diff>
--- a/Bellabeat/Détails_étude_de_cas_Bellabeat.docx
+++ b/Bellabeat/Détails_étude_de_cas_Bellabeat.docx
@@ -31,8 +31,20 @@
           <w:szCs w:val="36"/>
           <w:u w:val="single"/>
         </w:rPr>
-        <w:t>2 – Bellabeat</w:t>
-      </w:r>
+        <w:t xml:space="preserve">2 – </w:t>
+      </w:r>
+      <w:proofErr w:type="spellStart"/>
+      <w:r>
+        <w:rPr>
+          <w:b/>
+          <w:bCs/>
+          <w:sz w:val="36"/>
+          <w:szCs w:val="36"/>
+          <w:u w:val="single"/>
+        </w:rPr>
+        <w:t>Bellabeat</w:t>
+      </w:r>
+      <w:proofErr w:type="spellEnd"/>
     </w:p>
     <w:p>
       <w:pPr>
@@ -52,19 +64,62 @@
       <w:r>
         <w:t xml:space="preserve"> sur </w:t>
       </w:r>
-      <w:hyperlink r:id="rId5" w:history="1">
-        <w:r>
-          <w:rPr>
-            <w:rStyle w:val="Lienhypertexte"/>
-          </w:rPr>
-          <w:t>https://www.drawdb.app/</w:t>
-        </w:r>
-      </w:hyperlink>
+      <w:r>
+        <w:t>https://www.drawdb.app/editor?shareId=2bf6a89bbfd423d3fb5a61251e694ebf</w:t>
+      </w:r>
+    </w:p>
+    <w:p>
+      <w:r>
+        <w:drawing>
+          <wp:inline distT="0" distB="0" distL="0" distR="0" wp14:anchorId="4757B011" wp14:editId="1F970818">
+            <wp:extent cx="5760720" cy="2723515"/>
+            <wp:effectExtent l="0" t="0" r="0" b="635"/>
+            <wp:docPr id="1" name="Image 1"/>
+            <wp:cNvGraphicFramePr>
+              <a:graphicFrameLocks xmlns:a="http://schemas.openxmlformats.org/drawingml/2006/main" noChangeAspect="1"/>
+            </wp:cNvGraphicFramePr>
+            <a:graphic xmlns:a="http://schemas.openxmlformats.org/drawingml/2006/main">
+              <a:graphicData uri="http://schemas.openxmlformats.org/drawingml/2006/picture">
+                <pic:pic xmlns:pic="http://schemas.openxmlformats.org/drawingml/2006/picture">
+                  <pic:nvPicPr>
+                    <pic:cNvPr id="1" name=""/>
+                    <pic:cNvPicPr/>
+                  </pic:nvPicPr>
+                  <pic:blipFill>
+                    <a:blip r:embed="rId5"/>
+                    <a:stretch>
+                      <a:fillRect/>
+                    </a:stretch>
+                  </pic:blipFill>
+                  <pic:spPr>
+                    <a:xfrm>
+                      <a:off x="0" y="0"/>
+                      <a:ext cx="5760720" cy="2723515"/>
+                    </a:xfrm>
+                    <a:prstGeom prst="rect">
+                      <a:avLst/>
+                    </a:prstGeom>
+                  </pic:spPr>
+                </pic:pic>
+              </a:graphicData>
+            </a:graphic>
+          </wp:inline>
+        </w:drawing>
+      </w:r>
     </w:p>
     <w:p/>
+    <w:p/>
     <w:p>
       <w:r>
-        <w:t xml:space="preserve">BDD CSV importée depuis MySQL workbench à l’aide d’un script python (visible ici : </w:t>
+        <w:t xml:space="preserve">BDD CSV importée depuis MySQL </w:t>
+      </w:r>
+      <w:proofErr w:type="spellStart"/>
+      <w:r>
+        <w:t>workbench</w:t>
+      </w:r>
+      <w:proofErr w:type="spellEnd"/>
+      <w:r>
+        <w:t xml:space="preserve"> à l’aide d’un script python (visible ici : </w:t>
       </w:r>
       <w:hyperlink r:id="rId6" w:history="1">
         <w:r>
@@ -77,17 +132,9 @@
       <w:r>
         <w:t xml:space="preserve">)  création de 15 tables qui représente 3 </w:t>
       </w:r>
-      <w:proofErr w:type="gramStart"/>
-      <w:r>
-        <w:t>grand</w:t>
-      </w:r>
-      <w:r>
-        <w:t>s</w:t>
-      </w:r>
-      <w:r>
-        <w:t xml:space="preserve"> groupe</w:t>
-      </w:r>
-      <w:proofErr w:type="gramEnd"/>
+      <w:r>
+        <w:t>grands groupes</w:t>
+      </w:r>
       <w:r>
         <w:t xml:space="preserve"> de données : 1 : Les données journalières, 2 : les données par heure, 3 : les données par minutes, 4 : les autres données.</w:t>
       </w:r>

</xml_diff>